<commit_message>
feat: update metrics module and AI analysis config
</commit_message>
<xml_diff>
--- a/src/api/v1/templates/Carta_UniPutumayo.docx
+++ b/src/api/v1/templates/Carta_UniPutumayo.docx
@@ -170,7 +170,7 @@
           <w:bCs/>
           <w:lang w:val="es-ES"/>
         </w:rPr>
-        <w:t>Asignatura: [[nombre_materia]] ([[codigo_materia]]) — Promedio: [[promedio_general]]</w:t>
+        <w:t>Asignatura: [[nombre_materia]] ([[codigo_materia]]) — Promedio: [[promedio_general]] ( [[formula_nota_final]] )</w:t>
       </w:r>
     </w:p>
     <w:p>
@@ -285,7 +285,7 @@
           <w:bCs/>
           <w:lang w:val="es-ES"/>
         </w:rPr>
-        <w:t xml:space="preserve">Promedio General: [[promedio_general]]  </w:t>
+        <w:t xml:space="preserve">Promedio General: [[promedio_general]] ( [[formula_nota_final]] )  </w:t>
       </w:r>
     </w:p>
     <w:p>
@@ -1073,7 +1073,7 @@
                 <w:bCs/>
                 <w:lang w:val="es-ES"/>
               </w:rPr>
-              <w:t>[[promedio]]</w:t>
+              <w:t>[[promedio]] ( [[formula_aspecto]] )</w:t>
             </w:r>
           </w:p>
         </w:tc>

</xml_diff>